<commit_message>
Started working on the logistics. Started with creating the Logistics manager and some of the objects that will be used to track jobs/assignments
</commit_message>
<xml_diff>
--- a/ContentSourceFiles/SAS_Logistics Doc.docx
+++ b/ContentSourceFiles/SAS_Logistics Doc.docx
@@ -683,7 +683,10 @@
         <w:pStyle w:val="Heading2"/>
       </w:pPr>
       <w:r>
-        <w:t>Transitions</w:t>
+        <w:t>Transition</w:t>
+      </w:r>
+      <w:r>
+        <w:t xml:space="preserve"> Workflows</w:t>
       </w:r>
     </w:p>
     <w:p>
@@ -772,6 +775,26 @@
       </w:pPr>
       <w:r>
         <w:t>If so, exit those jobs and notify LM</w:t>
+      </w:r>
+    </w:p>
+    <w:p>
+      <w:pPr>
+        <w:pStyle w:val="Heading3"/>
+      </w:pPr>
+      <w:r>
+        <w:t>Manual to Idle</w:t>
+      </w:r>
+    </w:p>
+    <w:p>
+      <w:pPr>
+        <w:pStyle w:val="ListParagraph"/>
+        <w:numPr>
+          <w:ilvl w:val="0"/>
+          <w:numId w:val="4"/>
+        </w:numPr>
+      </w:pPr>
+      <w:r>
+        <w:t>TBD</w:t>
       </w:r>
     </w:p>
     <w:p/>
@@ -1083,7 +1106,7 @@
   <w:abstractNum w:abstractNumId="2" w15:restartNumberingAfterBreak="0">
     <w:nsid w:val="3DBF0518"/>
     <w:multiLevelType w:val="hybridMultilevel"/>
-    <w:tmpl w:val="31107FC8"/>
+    <w:tmpl w:val="FD902666"/>
     <w:lvl w:ilvl="0" w:tplc="04090001">
       <w:start w:val="1"/>
       <w:numFmt w:val="bullet"/>

</xml_diff>